<commit_message>
License and privacy policy added
</commit_message>
<xml_diff>
--- a/Privacy Policy_en.docx
+++ b/Privacy Policy_en.docx
@@ -24,6 +24,31 @@
           <w:lang w:val="en-GB" w:eastAsia="it-IT"/>
           <w14:ligatures w14:val="none"/>
         </w:rPr>
+        <w:t>PBIP Accessibility Skill plugin for Claude.</w:t>
+      </w:r>
+    </w:p>
+    <w:p>
+      <w:pPr>
+        <w:spacing w:before="100" w:beforeAutospacing="1" w:after="100" w:afterAutospacing="1" w:line="300" w:lineRule="atLeast"/>
+        <w:outlineLvl w:val="0"/>
+        <w:rPr>
+          <w:rFonts w:ascii="Segoe UI" w:eastAsia="Times New Roman" w:hAnsi="Segoe UI" w:cs="Segoe UI"/>
+          <w:b/>
+          <w:bCs/>
+          <w:kern w:val="36"/>
+          <w:lang w:val="en-GB" w:eastAsia="it-IT"/>
+          <w14:ligatures w14:val="none"/>
+        </w:rPr>
+      </w:pPr>
+      <w:r>
+        <w:rPr>
+          <w:rFonts w:ascii="Segoe UI" w:eastAsia="Times New Roman" w:hAnsi="Segoe UI" w:cs="Segoe UI"/>
+          <w:b/>
+          <w:bCs/>
+          <w:kern w:val="36"/>
+          <w:lang w:val="en-GB" w:eastAsia="it-IT"/>
+          <w14:ligatures w14:val="none"/>
+        </w:rPr>
         <w:t>Privacy Policy</w:t>
       </w:r>
     </w:p>
@@ -121,7 +146,26 @@
           <w14:ligatures w14:val="none"/>
         </w:rPr>
         <w:br/>
-        <w:t>Email: privacy@iconsulting.biz</w:t>
+      </w:r>
+      <w:proofErr w:type="gramStart"/>
+      <w:r>
+        <w:rPr>
+          <w:rFonts w:ascii="Segoe UI" w:eastAsia="Times New Roman" w:hAnsi="Segoe UI" w:cs="Segoe UI"/>
+          <w:kern w:val="0"/>
+          <w:lang w:eastAsia="it-IT"/>
+          <w14:ligatures w14:val="none"/>
+        </w:rPr>
+        <w:t>Email</w:t>
+      </w:r>
+      <w:proofErr w:type="gramEnd"/>
+      <w:r>
+        <w:rPr>
+          <w:rFonts w:ascii="Segoe UI" w:eastAsia="Times New Roman" w:hAnsi="Segoe UI" w:cs="Segoe UI"/>
+          <w:kern w:val="0"/>
+          <w:lang w:eastAsia="it-IT"/>
+          <w14:ligatures w14:val="none"/>
+        </w:rPr>
+        <w:t>: privacy@iconsulting.biz</w:t>
       </w:r>
     </w:p>
     <w:p>
@@ -275,7 +319,7 @@
         <w:rPr>
           <w:rFonts w:ascii="Segoe UI" w:eastAsia="Times New Roman" w:hAnsi="Segoe UI" w:cs="Segoe UI"/>
           <w:kern w:val="0"/>
-          <w:lang w:eastAsia="it-IT"/>
+          <w:lang w:val="en-GB" w:eastAsia="it-IT"/>
           <w14:ligatures w14:val="none"/>
         </w:rPr>
       </w:pPr>
@@ -625,6 +669,7 @@
           <w:lang w:eastAsia="it-IT"/>
           <w14:ligatures w14:val="none"/>
         </w:rPr>
+        <w:lastRenderedPageBreak/>
         <w:t>ICONSULTING;</w:t>
       </w:r>
     </w:p>
@@ -649,7 +694,6 @@
           <w:lang w:eastAsia="it-IT"/>
           <w14:ligatures w14:val="none"/>
         </w:rPr>
-        <w:lastRenderedPageBreak/>
         <w:t>service providers;</w:t>
       </w:r>
     </w:p>

</xml_diff>